<commit_message>
API Dokumentáció: Bevezetés elkészítése
</commit_message>
<xml_diff>
--- a/MaturaSmart/API_Dokumentacio_MaturaSmart.docx
+++ b/MaturaSmart/API_Dokumentacio_MaturaSmart.docx
@@ -2,15 +2,1768 @@
 <file path=word/document.xml><?xml version="1.0" encoding="utf-8"?>
 <w:document xmlns:wpc="http://schemas.microsoft.com/office/word/2010/wordprocessingCanvas" xmlns:cx="http://schemas.microsoft.com/office/drawing/2014/chartex" xmlns:cx1="http://schemas.microsoft.com/office/drawing/2015/9/8/chartex" xmlns:cx2="http://schemas.microsoft.com/office/drawing/2015/10/21/chartex" xmlns:cx3="http://schemas.microsoft.com/office/drawing/2016/5/9/chartex" xmlns:cx4="http://schemas.microsoft.com/office/drawing/2016/5/10/chartex" xmlns:cx5="http://schemas.microsoft.com/office/drawing/2016/5/11/chartex" xmlns:cx6="http://schemas.microsoft.com/office/drawing/2016/5/12/chartex" xmlns:cx7="http://schemas.microsoft.com/office/drawing/2016/5/13/chartex" xmlns:cx8="http://schemas.microsoft.com/office/drawing/2016/5/14/chartex" xmlns:mc="http://schemas.openxmlformats.org/markup-compatibility/2006" xmlns:aink="http://schemas.microsoft.com/office/drawing/2016/ink" xmlns:am3d="http://schemas.microsoft.com/office/drawing/2017/model3d" xmlns:o="urn:schemas-microsoft-com:office:office" xmlns:oel="http://schemas.microsoft.com/office/2019/extlst" xmlns:r="http://schemas.openxmlformats.org/officeDocument/2006/relationships" xmlns:m="http://schemas.openxmlformats.org/officeDocument/2006/math" xmlns:v="urn:schemas-microsoft-com:vml" xmlns:wp14="http://schemas.microsoft.com/office/word/2010/wordprocessingDrawing" xmlns:wp="http://schemas.openxmlformats.org/drawingml/2006/wordprocessingDrawing" xmlns:w10="urn:schemas-microsoft-com:office:word" xmlns:w="http://schemas.openxmlformats.org/wordprocessingml/2006/main" xmlns:w14="http://schemas.microsoft.com/office/word/2010/wordml" xmlns:w15="http://schemas.microsoft.com/office/word/2012/wordml" xmlns:w16cex="http://schemas.microsoft.com/office/word/2018/wordml/cex" xmlns:w16cid="http://schemas.microsoft.com/office/word/2016/wordml/cid" xmlns:w16="http://schemas.microsoft.com/office/word/2018/wordml" xmlns:w16du="http://schemas.microsoft.com/office/word/2023/wordml/word16du" xmlns:w16sdtdh="http://schemas.microsoft.com/office/word/2020/wordml/sdtdatahash" xmlns:w16sdtfl="http://schemas.microsoft.com/office/word/2024/wordml/sdtformatlock" xmlns:w16se="http://schemas.microsoft.com/office/word/2015/wordml/symex" xmlns:wpg="http://schemas.microsoft.com/office/word/2010/wordprocessingGroup" xmlns:wpi="http://schemas.microsoft.com/office/word/2010/wordprocessingInk" xmlns:wne="http://schemas.microsoft.com/office/word/2006/wordml" xmlns:wps="http://schemas.microsoft.com/office/word/2010/wordprocessingShape" mc:Ignorable="w14 w15 w16se w16cid w16 w16cex w16sdtdh w16sdtfl w16du wp14">
   <w:body>
+    <w:p>
+      <w:pPr>
+        <w:spacing w:before="100" w:beforeAutospacing="1" w:after="100" w:afterAutospacing="1" w:line="240" w:lineRule="auto"/>
+        <w:outlineLvl w:val="0"/>
+        <w:rPr>
+          <w:rFonts w:ascii="Times New Roman" w:eastAsia="Times New Roman" w:hAnsi="Times New Roman" w:cs="Times New Roman"/>
+          <w:b/>
+          <w:bCs/>
+          <w:kern w:val="36"/>
+          <w:sz w:val="48"/>
+          <w:szCs w:val="48"/>
+          <w:lang w:eastAsia="hu-HU"/>
+          <w14:ligatures w14:val="none"/>
+        </w:rPr>
+      </w:pPr>
+      <w:r>
+        <w:rPr>
+          <w:rFonts w:ascii="Times New Roman" w:eastAsia="Times New Roman" w:hAnsi="Times New Roman" w:cs="Times New Roman"/>
+          <w:b/>
+          <w:bCs/>
+          <w:kern w:val="36"/>
+          <w:sz w:val="48"/>
+          <w:szCs w:val="48"/>
+          <w:lang w:eastAsia="hu-HU"/>
+          <w14:ligatures w14:val="none"/>
+        </w:rPr>
+        <w:t>API Dokumentáció</w:t>
+      </w:r>
+    </w:p>
+    <w:p>
+      <w:pPr>
+        <w:spacing w:before="100" w:beforeAutospacing="1" w:after="100" w:afterAutospacing="1" w:line="240" w:lineRule="auto"/>
+        <w:outlineLvl w:val="1"/>
+        <w:rPr>
+          <w:rFonts w:ascii="Times New Roman" w:eastAsia="Times New Roman" w:hAnsi="Times New Roman" w:cs="Times New Roman"/>
+          <w:b/>
+          <w:bCs/>
+          <w:kern w:val="0"/>
+          <w:sz w:val="36"/>
+          <w:szCs w:val="36"/>
+          <w:lang w:eastAsia="hu-HU"/>
+          <w14:ligatures w14:val="none"/>
+        </w:rPr>
+      </w:pPr>
+      <w:r>
+        <w:rPr>
+          <w:rFonts w:ascii="Times New Roman" w:eastAsia="Times New Roman" w:hAnsi="Times New Roman" w:cs="Times New Roman"/>
+          <w:b/>
+          <w:bCs/>
+          <w:kern w:val="0"/>
+          <w:sz w:val="36"/>
+          <w:szCs w:val="36"/>
+          <w:lang w:eastAsia="hu-HU"/>
+          <w14:ligatures w14:val="none"/>
+        </w:rPr>
+        <w:t>1. Bevezetés</w:t>
+      </w:r>
+    </w:p>
+    <w:p>
+      <w:pPr>
+        <w:spacing w:before="100" w:beforeAutospacing="1" w:after="100" w:afterAutospacing="1" w:line="240" w:lineRule="auto"/>
+        <w:outlineLvl w:val="2"/>
+        <w:rPr>
+          <w:rFonts w:ascii="Times New Roman" w:eastAsia="Times New Roman" w:hAnsi="Times New Roman" w:cs="Times New Roman"/>
+          <w:b/>
+          <w:bCs/>
+          <w:kern w:val="0"/>
+          <w:sz w:val="27"/>
+          <w:szCs w:val="27"/>
+          <w:lang w:eastAsia="hu-HU"/>
+          <w14:ligatures w14:val="none"/>
+        </w:rPr>
+      </w:pPr>
+      <w:r>
+        <w:rPr>
+          <w:rFonts w:ascii="Times New Roman" w:eastAsia="Times New Roman" w:hAnsi="Times New Roman" w:cs="Times New Roman"/>
+          <w:b/>
+          <w:bCs/>
+          <w:kern w:val="0"/>
+          <w:sz w:val="27"/>
+          <w:szCs w:val="27"/>
+          <w:lang w:eastAsia="hu-HU"/>
+          <w14:ligatures w14:val="none"/>
+        </w:rPr>
+        <w:t>1.1 Célkitűzés</w:t>
+      </w:r>
+    </w:p>
+    <w:p>
+      <w:pPr>
+        <w:spacing w:before="100" w:beforeAutospacing="1" w:after="100" w:afterAutospacing="1" w:line="240" w:lineRule="auto"/>
+        <w:rPr>
+          <w:rFonts w:ascii="Times New Roman" w:eastAsia="Times New Roman" w:hAnsi="Times New Roman" w:cs="Times New Roman"/>
+          <w:kern w:val="0"/>
+          <w:lang w:eastAsia="hu-HU"/>
+          <w14:ligatures w14:val="none"/>
+        </w:rPr>
+      </w:pPr>
+      <w:r>
+        <w:rPr>
+          <w:rFonts w:ascii="Times New Roman" w:eastAsia="Times New Roman" w:hAnsi="Times New Roman" w:cs="Times New Roman"/>
+          <w:kern w:val="0"/>
+          <w:lang w:eastAsia="hu-HU"/>
+          <w14:ligatures w14:val="none"/>
+        </w:rPr>
+        <w:t xml:space="preserve">A dokumentum a backend API </w:t>
+      </w:r>
+      <w:proofErr w:type="spellStart"/>
+      <w:r>
+        <w:rPr>
+          <w:rFonts w:ascii="Times New Roman" w:eastAsia="Times New Roman" w:hAnsi="Times New Roman" w:cs="Times New Roman"/>
+          <w:kern w:val="0"/>
+          <w:lang w:eastAsia="hu-HU"/>
+          <w14:ligatures w14:val="none"/>
+        </w:rPr>
+        <w:t>endpointjainak</w:t>
+      </w:r>
+      <w:proofErr w:type="spellEnd"/>
+      <w:r>
+        <w:rPr>
+          <w:rFonts w:ascii="Times New Roman" w:eastAsia="Times New Roman" w:hAnsi="Times New Roman" w:cs="Times New Roman"/>
+          <w:kern w:val="0"/>
+          <w:lang w:eastAsia="hu-HU"/>
+          <w14:ligatures w14:val="none"/>
+        </w:rPr>
+        <w:t xml:space="preserve"> részletes leírását tartalmazza.</w:t>
+      </w:r>
+      <w:r>
+        <w:rPr>
+          <w:rFonts w:ascii="Times New Roman" w:eastAsia="Times New Roman" w:hAnsi="Times New Roman" w:cs="Times New Roman"/>
+          <w:kern w:val="0"/>
+          <w:lang w:eastAsia="hu-HU"/>
+          <w14:ligatures w14:val="none"/>
+        </w:rPr>
+        <w:br/>
+        <w:t xml:space="preserve">A frontend alkalmazás (pl. </w:t>
+      </w:r>
+      <w:proofErr w:type="spellStart"/>
+      <w:r>
+        <w:rPr>
+          <w:rFonts w:ascii="Times New Roman" w:eastAsia="Times New Roman" w:hAnsi="Times New Roman" w:cs="Times New Roman"/>
+          <w:kern w:val="0"/>
+          <w:lang w:eastAsia="hu-HU"/>
+          <w14:ligatures w14:val="none"/>
+        </w:rPr>
+        <w:t>Vue</w:t>
+      </w:r>
+      <w:proofErr w:type="spellEnd"/>
+      <w:r>
+        <w:rPr>
+          <w:rFonts w:ascii="Times New Roman" w:eastAsia="Times New Roman" w:hAnsi="Times New Roman" w:cs="Times New Roman"/>
+          <w:kern w:val="0"/>
+          <w:lang w:eastAsia="hu-HU"/>
+          <w14:ligatures w14:val="none"/>
+        </w:rPr>
+        <w:t xml:space="preserve"> / </w:t>
+      </w:r>
+      <w:proofErr w:type="spellStart"/>
+      <w:r>
+        <w:rPr>
+          <w:rFonts w:ascii="Times New Roman" w:eastAsia="Times New Roman" w:hAnsi="Times New Roman" w:cs="Times New Roman"/>
+          <w:kern w:val="0"/>
+          <w:lang w:eastAsia="hu-HU"/>
+          <w14:ligatures w14:val="none"/>
+        </w:rPr>
+        <w:t>React</w:t>
+      </w:r>
+      <w:proofErr w:type="spellEnd"/>
+      <w:r>
+        <w:rPr>
+          <w:rFonts w:ascii="Times New Roman" w:eastAsia="Times New Roman" w:hAnsi="Times New Roman" w:cs="Times New Roman"/>
+          <w:kern w:val="0"/>
+          <w:lang w:eastAsia="hu-HU"/>
+          <w14:ligatures w14:val="none"/>
+        </w:rPr>
+        <w:t xml:space="preserve">) ezeken az </w:t>
+      </w:r>
+      <w:proofErr w:type="spellStart"/>
+      <w:r>
+        <w:rPr>
+          <w:rFonts w:ascii="Times New Roman" w:eastAsia="Times New Roman" w:hAnsi="Times New Roman" w:cs="Times New Roman"/>
+          <w:kern w:val="0"/>
+          <w:lang w:eastAsia="hu-HU"/>
+          <w14:ligatures w14:val="none"/>
+        </w:rPr>
+        <w:t>endpointokon</w:t>
+      </w:r>
+      <w:proofErr w:type="spellEnd"/>
+      <w:r>
+        <w:rPr>
+          <w:rFonts w:ascii="Times New Roman" w:eastAsia="Times New Roman" w:hAnsi="Times New Roman" w:cs="Times New Roman"/>
+          <w:kern w:val="0"/>
+          <w:lang w:eastAsia="hu-HU"/>
+          <w14:ligatures w14:val="none"/>
+        </w:rPr>
+        <w:t xml:space="preserve"> keresztül kommunikál a </w:t>
+      </w:r>
+      <w:proofErr w:type="spellStart"/>
+      <w:r>
+        <w:rPr>
+          <w:rFonts w:ascii="Times New Roman" w:eastAsia="Times New Roman" w:hAnsi="Times New Roman" w:cs="Times New Roman"/>
+          <w:kern w:val="0"/>
+          <w:lang w:eastAsia="hu-HU"/>
+          <w14:ligatures w14:val="none"/>
+        </w:rPr>
+        <w:t>Laravel</w:t>
+      </w:r>
+      <w:proofErr w:type="spellEnd"/>
+      <w:r>
+        <w:rPr>
+          <w:rFonts w:ascii="Times New Roman" w:eastAsia="Times New Roman" w:hAnsi="Times New Roman" w:cs="Times New Roman"/>
+          <w:kern w:val="0"/>
+          <w:lang w:eastAsia="hu-HU"/>
+          <w14:ligatures w14:val="none"/>
+        </w:rPr>
+        <w:t xml:space="preserve"> alapú backend rendszerrel.</w:t>
+      </w:r>
+    </w:p>
+    <w:p>
+      <w:pPr>
+        <w:spacing w:before="100" w:beforeAutospacing="1" w:after="100" w:afterAutospacing="1" w:line="240" w:lineRule="auto"/>
+        <w:rPr>
+          <w:rFonts w:ascii="Times New Roman" w:eastAsia="Times New Roman" w:hAnsi="Times New Roman" w:cs="Times New Roman"/>
+          <w:kern w:val="0"/>
+          <w:lang w:eastAsia="hu-HU"/>
+          <w14:ligatures w14:val="none"/>
+        </w:rPr>
+      </w:pPr>
+      <w:r>
+        <w:rPr>
+          <w:rFonts w:ascii="Times New Roman" w:eastAsia="Times New Roman" w:hAnsi="Times New Roman" w:cs="Times New Roman"/>
+          <w:kern w:val="0"/>
+          <w:lang w:eastAsia="hu-HU"/>
+          <w14:ligatures w14:val="none"/>
+        </w:rPr>
+        <w:t>A rendszer fő funkciói:</w:t>
+      </w:r>
+    </w:p>
+    <w:p>
+      <w:pPr>
+        <w:numPr>
+          <w:ilvl w:val="0"/>
+          <w:numId w:val="1"/>
+        </w:numPr>
+        <w:spacing w:before="100" w:beforeAutospacing="1" w:after="100" w:afterAutospacing="1" w:line="240" w:lineRule="auto"/>
+        <w:rPr>
+          <w:rFonts w:ascii="Times New Roman" w:eastAsia="Times New Roman" w:hAnsi="Times New Roman" w:cs="Times New Roman"/>
+          <w:kern w:val="0"/>
+          <w:lang w:eastAsia="hu-HU"/>
+          <w14:ligatures w14:val="none"/>
+        </w:rPr>
+      </w:pPr>
+      <w:r>
+        <w:rPr>
+          <w:rFonts w:ascii="Times New Roman" w:eastAsia="Times New Roman" w:hAnsi="Times New Roman" w:cs="Times New Roman"/>
+          <w:kern w:val="0"/>
+          <w:lang w:eastAsia="hu-HU"/>
+          <w14:ligatures w14:val="none"/>
+        </w:rPr>
+        <w:t xml:space="preserve">felhasználói </w:t>
+      </w:r>
+      <w:proofErr w:type="spellStart"/>
+      <w:r>
+        <w:rPr>
+          <w:rFonts w:ascii="Times New Roman" w:eastAsia="Times New Roman" w:hAnsi="Times New Roman" w:cs="Times New Roman"/>
+          <w:kern w:val="0"/>
+          <w:lang w:eastAsia="hu-HU"/>
+          <w14:ligatures w14:val="none"/>
+        </w:rPr>
+        <w:t>autentikáció</w:t>
+      </w:r>
+      <w:proofErr w:type="spellEnd"/>
+      <w:r>
+        <w:rPr>
+          <w:rFonts w:ascii="Times New Roman" w:eastAsia="Times New Roman" w:hAnsi="Times New Roman" w:cs="Times New Roman"/>
+          <w:kern w:val="0"/>
+          <w:lang w:eastAsia="hu-HU"/>
+          <w14:ligatures w14:val="none"/>
+        </w:rPr>
+        <w:t xml:space="preserve"> (</w:t>
+      </w:r>
+      <w:proofErr w:type="spellStart"/>
+      <w:r>
+        <w:rPr>
+          <w:rFonts w:ascii="Times New Roman" w:eastAsia="Times New Roman" w:hAnsi="Times New Roman" w:cs="Times New Roman"/>
+          <w:kern w:val="0"/>
+          <w:lang w:eastAsia="hu-HU"/>
+          <w14:ligatures w14:val="none"/>
+        </w:rPr>
+        <w:t>Sanctum</w:t>
+      </w:r>
+      <w:proofErr w:type="spellEnd"/>
+      <w:r>
+        <w:rPr>
+          <w:rFonts w:ascii="Times New Roman" w:eastAsia="Times New Roman" w:hAnsi="Times New Roman" w:cs="Times New Roman"/>
+          <w:kern w:val="0"/>
+          <w:lang w:eastAsia="hu-HU"/>
+          <w14:ligatures w14:val="none"/>
+        </w:rPr>
+        <w:t xml:space="preserve"> </w:t>
+      </w:r>
+      <w:proofErr w:type="spellStart"/>
+      <w:r>
+        <w:rPr>
+          <w:rFonts w:ascii="Times New Roman" w:eastAsia="Times New Roman" w:hAnsi="Times New Roman" w:cs="Times New Roman"/>
+          <w:kern w:val="0"/>
+          <w:lang w:eastAsia="hu-HU"/>
+          <w14:ligatures w14:val="none"/>
+        </w:rPr>
+        <w:t>token</w:t>
+      </w:r>
+      <w:proofErr w:type="spellEnd"/>
+      <w:r>
+        <w:rPr>
+          <w:rFonts w:ascii="Times New Roman" w:eastAsia="Times New Roman" w:hAnsi="Times New Roman" w:cs="Times New Roman"/>
+          <w:kern w:val="0"/>
+          <w:lang w:eastAsia="hu-HU"/>
+          <w14:ligatures w14:val="none"/>
+        </w:rPr>
+        <w:t>)</w:t>
+      </w:r>
+    </w:p>
+    <w:p>
+      <w:pPr>
+        <w:numPr>
+          <w:ilvl w:val="0"/>
+          <w:numId w:val="1"/>
+        </w:numPr>
+        <w:spacing w:before="100" w:beforeAutospacing="1" w:after="100" w:afterAutospacing="1" w:line="240" w:lineRule="auto"/>
+        <w:rPr>
+          <w:rFonts w:ascii="Times New Roman" w:eastAsia="Times New Roman" w:hAnsi="Times New Roman" w:cs="Times New Roman"/>
+          <w:kern w:val="0"/>
+          <w:lang w:eastAsia="hu-HU"/>
+          <w14:ligatures w14:val="none"/>
+        </w:rPr>
+      </w:pPr>
+      <w:r>
+        <w:rPr>
+          <w:rFonts w:ascii="Times New Roman" w:eastAsia="Times New Roman" w:hAnsi="Times New Roman" w:cs="Times New Roman"/>
+          <w:kern w:val="0"/>
+          <w:lang w:eastAsia="hu-HU"/>
+          <w14:ligatures w14:val="none"/>
+        </w:rPr>
+        <w:t>publikus tananyag böngészés</w:t>
+      </w:r>
+    </w:p>
+    <w:p>
+      <w:pPr>
+        <w:numPr>
+          <w:ilvl w:val="0"/>
+          <w:numId w:val="1"/>
+        </w:numPr>
+        <w:spacing w:before="100" w:beforeAutospacing="1" w:after="100" w:afterAutospacing="1" w:line="240" w:lineRule="auto"/>
+        <w:rPr>
+          <w:rFonts w:ascii="Times New Roman" w:eastAsia="Times New Roman" w:hAnsi="Times New Roman" w:cs="Times New Roman"/>
+          <w:kern w:val="0"/>
+          <w:lang w:eastAsia="hu-HU"/>
+          <w14:ligatures w14:val="none"/>
+        </w:rPr>
+      </w:pPr>
+      <w:r>
+        <w:rPr>
+          <w:rFonts w:ascii="Times New Roman" w:eastAsia="Times New Roman" w:hAnsi="Times New Roman" w:cs="Times New Roman"/>
+          <w:kern w:val="0"/>
+          <w:lang w:eastAsia="hu-HU"/>
+          <w14:ligatures w14:val="none"/>
+        </w:rPr>
+        <w:t>felhasználói profilkezelés</w:t>
+      </w:r>
+    </w:p>
+    <w:p>
+      <w:pPr>
+        <w:numPr>
+          <w:ilvl w:val="0"/>
+          <w:numId w:val="1"/>
+        </w:numPr>
+        <w:spacing w:before="100" w:beforeAutospacing="1" w:after="100" w:afterAutospacing="1" w:line="240" w:lineRule="auto"/>
+        <w:rPr>
+          <w:rFonts w:ascii="Times New Roman" w:eastAsia="Times New Roman" w:hAnsi="Times New Roman" w:cs="Times New Roman"/>
+          <w:kern w:val="0"/>
+          <w:lang w:eastAsia="hu-HU"/>
+          <w14:ligatures w14:val="none"/>
+        </w:rPr>
+      </w:pPr>
+      <w:proofErr w:type="spellStart"/>
+      <w:r>
+        <w:rPr>
+          <w:rFonts w:ascii="Times New Roman" w:eastAsia="Times New Roman" w:hAnsi="Times New Roman" w:cs="Times New Roman"/>
+          <w:kern w:val="0"/>
+          <w:lang w:eastAsia="hu-HU"/>
+          <w14:ligatures w14:val="none"/>
+        </w:rPr>
+        <w:t>gamification</w:t>
+      </w:r>
+      <w:proofErr w:type="spellEnd"/>
+      <w:r>
+        <w:rPr>
+          <w:rFonts w:ascii="Times New Roman" w:eastAsia="Times New Roman" w:hAnsi="Times New Roman" w:cs="Times New Roman"/>
+          <w:kern w:val="0"/>
+          <w:lang w:eastAsia="hu-HU"/>
+          <w14:ligatures w14:val="none"/>
+        </w:rPr>
+        <w:t xml:space="preserve"> (pontok, ranglista)</w:t>
+      </w:r>
+    </w:p>
+    <w:p>
+      <w:pPr>
+        <w:numPr>
+          <w:ilvl w:val="0"/>
+          <w:numId w:val="1"/>
+        </w:numPr>
+        <w:spacing w:before="100" w:beforeAutospacing="1" w:after="100" w:afterAutospacing="1" w:line="240" w:lineRule="auto"/>
+        <w:rPr>
+          <w:rFonts w:ascii="Times New Roman" w:eastAsia="Times New Roman" w:hAnsi="Times New Roman" w:cs="Times New Roman"/>
+          <w:kern w:val="0"/>
+          <w:lang w:eastAsia="hu-HU"/>
+          <w14:ligatures w14:val="none"/>
+        </w:rPr>
+      </w:pPr>
+      <w:r>
+        <w:rPr>
+          <w:rFonts w:ascii="Times New Roman" w:eastAsia="Times New Roman" w:hAnsi="Times New Roman" w:cs="Times New Roman"/>
+          <w:kern w:val="0"/>
+          <w:lang w:eastAsia="hu-HU"/>
+          <w14:ligatures w14:val="none"/>
+        </w:rPr>
+        <w:t>adminisztrátori CRUD műveletek</w:t>
+      </w:r>
+    </w:p>
+    <w:p>
+      <w:pPr>
+        <w:spacing w:after="0" w:line="240" w:lineRule="auto"/>
+        <w:rPr>
+          <w:rFonts w:ascii="Times New Roman" w:eastAsia="Times New Roman" w:hAnsi="Times New Roman" w:cs="Times New Roman"/>
+          <w:kern w:val="0"/>
+          <w:lang w:eastAsia="hu-HU"/>
+          <w14:ligatures w14:val="none"/>
+        </w:rPr>
+      </w:pPr>
+      <w:r>
+        <w:rPr>
+          <w:rFonts w:ascii="Times New Roman" w:eastAsia="Times New Roman" w:hAnsi="Times New Roman" w:cs="Times New Roman"/>
+          <w:kern w:val="0"/>
+          <w:lang w:eastAsia="hu-HU"/>
+          <w14:ligatures w14:val="none"/>
+        </w:rPr>
+        <w:pict w14:anchorId="29256991">
+          <v:rect id="_x0000_i1025" style="width:0;height:1.5pt" o:hralign="center" o:hrstd="t" o:hr="t" fillcolor="#a0a0a0" stroked="f"/>
+        </w:pict>
+      </w:r>
+    </w:p>
+    <w:p>
+      <w:pPr>
+        <w:spacing w:before="100" w:beforeAutospacing="1" w:after="100" w:afterAutospacing="1" w:line="240" w:lineRule="auto"/>
+        <w:outlineLvl w:val="2"/>
+        <w:rPr>
+          <w:rFonts w:ascii="Times New Roman" w:eastAsia="Times New Roman" w:hAnsi="Times New Roman" w:cs="Times New Roman"/>
+          <w:b/>
+          <w:bCs/>
+          <w:kern w:val="0"/>
+          <w:sz w:val="27"/>
+          <w:szCs w:val="27"/>
+          <w:lang w:eastAsia="hu-HU"/>
+          <w14:ligatures w14:val="none"/>
+        </w:rPr>
+      </w:pPr>
+      <w:r>
+        <w:rPr>
+          <w:rFonts w:ascii="Times New Roman" w:eastAsia="Times New Roman" w:hAnsi="Times New Roman" w:cs="Times New Roman"/>
+          <w:b/>
+          <w:bCs/>
+          <w:kern w:val="0"/>
+          <w:sz w:val="27"/>
+          <w:szCs w:val="27"/>
+          <w:lang w:eastAsia="hu-HU"/>
+          <w14:ligatures w14:val="none"/>
+        </w:rPr>
+        <w:t>1.2 Technológiák</w:t>
+      </w:r>
+    </w:p>
+    <w:p>
+      <w:pPr>
+        <w:numPr>
+          <w:ilvl w:val="0"/>
+          <w:numId w:val="2"/>
+        </w:numPr>
+        <w:spacing w:before="100" w:beforeAutospacing="1" w:after="100" w:afterAutospacing="1" w:line="240" w:lineRule="auto"/>
+        <w:rPr>
+          <w:rFonts w:ascii="Times New Roman" w:eastAsia="Times New Roman" w:hAnsi="Times New Roman" w:cs="Times New Roman"/>
+          <w:kern w:val="0"/>
+          <w:lang w:eastAsia="hu-HU"/>
+          <w14:ligatures w14:val="none"/>
+        </w:rPr>
+      </w:pPr>
+      <w:r>
+        <w:rPr>
+          <w:rFonts w:ascii="Times New Roman" w:eastAsia="Times New Roman" w:hAnsi="Times New Roman" w:cs="Times New Roman"/>
+          <w:b/>
+          <w:bCs/>
+          <w:kern w:val="0"/>
+          <w:lang w:eastAsia="hu-HU"/>
+          <w14:ligatures w14:val="none"/>
+        </w:rPr>
+        <w:t>Backend:</w:t>
+      </w:r>
+      <w:r>
+        <w:rPr>
+          <w:rFonts w:ascii="Times New Roman" w:eastAsia="Times New Roman" w:hAnsi="Times New Roman" w:cs="Times New Roman"/>
+          <w:kern w:val="0"/>
+          <w:lang w:eastAsia="hu-HU"/>
+          <w14:ligatures w14:val="none"/>
+        </w:rPr>
+        <w:t xml:space="preserve"> </w:t>
+      </w:r>
+      <w:proofErr w:type="spellStart"/>
+      <w:r>
+        <w:rPr>
+          <w:rFonts w:ascii="Times New Roman" w:eastAsia="Times New Roman" w:hAnsi="Times New Roman" w:cs="Times New Roman"/>
+          <w:kern w:val="0"/>
+          <w:lang w:eastAsia="hu-HU"/>
+          <w14:ligatures w14:val="none"/>
+        </w:rPr>
+        <w:t>Laravel</w:t>
+      </w:r>
+      <w:proofErr w:type="spellEnd"/>
+      <w:r>
+        <w:rPr>
+          <w:rFonts w:ascii="Times New Roman" w:eastAsia="Times New Roman" w:hAnsi="Times New Roman" w:cs="Times New Roman"/>
+          <w:kern w:val="0"/>
+          <w:lang w:eastAsia="hu-HU"/>
+          <w14:ligatures w14:val="none"/>
+        </w:rPr>
+        <w:t xml:space="preserve"> (10 / 11)</w:t>
+      </w:r>
+    </w:p>
+    <w:p>
+      <w:pPr>
+        <w:numPr>
+          <w:ilvl w:val="0"/>
+          <w:numId w:val="2"/>
+        </w:numPr>
+        <w:spacing w:before="100" w:beforeAutospacing="1" w:after="100" w:afterAutospacing="1" w:line="240" w:lineRule="auto"/>
+        <w:rPr>
+          <w:rFonts w:ascii="Times New Roman" w:eastAsia="Times New Roman" w:hAnsi="Times New Roman" w:cs="Times New Roman"/>
+          <w:kern w:val="0"/>
+          <w:lang w:eastAsia="hu-HU"/>
+          <w14:ligatures w14:val="none"/>
+        </w:rPr>
+      </w:pPr>
+      <w:proofErr w:type="spellStart"/>
+      <w:r>
+        <w:rPr>
+          <w:rFonts w:ascii="Times New Roman" w:eastAsia="Times New Roman" w:hAnsi="Times New Roman" w:cs="Times New Roman"/>
+          <w:b/>
+          <w:bCs/>
+          <w:kern w:val="0"/>
+          <w:lang w:eastAsia="hu-HU"/>
+          <w14:ligatures w14:val="none"/>
+        </w:rPr>
+        <w:t>Autentikáció</w:t>
+      </w:r>
+      <w:proofErr w:type="spellEnd"/>
+      <w:r>
+        <w:rPr>
+          <w:rFonts w:ascii="Times New Roman" w:eastAsia="Times New Roman" w:hAnsi="Times New Roman" w:cs="Times New Roman"/>
+          <w:b/>
+          <w:bCs/>
+          <w:kern w:val="0"/>
+          <w:lang w:eastAsia="hu-HU"/>
+          <w14:ligatures w14:val="none"/>
+        </w:rPr>
+        <w:t>:</w:t>
+      </w:r>
+      <w:r>
+        <w:rPr>
+          <w:rFonts w:ascii="Times New Roman" w:eastAsia="Times New Roman" w:hAnsi="Times New Roman" w:cs="Times New Roman"/>
+          <w:kern w:val="0"/>
+          <w:lang w:eastAsia="hu-HU"/>
+          <w14:ligatures w14:val="none"/>
+        </w:rPr>
+        <w:t xml:space="preserve"> </w:t>
+      </w:r>
+      <w:proofErr w:type="spellStart"/>
+      <w:r>
+        <w:rPr>
+          <w:rFonts w:ascii="Times New Roman" w:eastAsia="Times New Roman" w:hAnsi="Times New Roman" w:cs="Times New Roman"/>
+          <w:kern w:val="0"/>
+          <w:lang w:eastAsia="hu-HU"/>
+          <w14:ligatures w14:val="none"/>
+        </w:rPr>
+        <w:t>Laravel</w:t>
+      </w:r>
+      <w:proofErr w:type="spellEnd"/>
+      <w:r>
+        <w:rPr>
+          <w:rFonts w:ascii="Times New Roman" w:eastAsia="Times New Roman" w:hAnsi="Times New Roman" w:cs="Times New Roman"/>
+          <w:kern w:val="0"/>
+          <w:lang w:eastAsia="hu-HU"/>
+          <w14:ligatures w14:val="none"/>
+        </w:rPr>
+        <w:t xml:space="preserve"> </w:t>
+      </w:r>
+      <w:proofErr w:type="spellStart"/>
+      <w:r>
+        <w:rPr>
+          <w:rFonts w:ascii="Times New Roman" w:eastAsia="Times New Roman" w:hAnsi="Times New Roman" w:cs="Times New Roman"/>
+          <w:kern w:val="0"/>
+          <w:lang w:eastAsia="hu-HU"/>
+          <w14:ligatures w14:val="none"/>
+        </w:rPr>
+        <w:t>Sanctum</w:t>
+      </w:r>
+      <w:proofErr w:type="spellEnd"/>
+      <w:r>
+        <w:rPr>
+          <w:rFonts w:ascii="Times New Roman" w:eastAsia="Times New Roman" w:hAnsi="Times New Roman" w:cs="Times New Roman"/>
+          <w:kern w:val="0"/>
+          <w:lang w:eastAsia="hu-HU"/>
+          <w14:ligatures w14:val="none"/>
+        </w:rPr>
+        <w:t xml:space="preserve"> (</w:t>
+      </w:r>
+      <w:proofErr w:type="spellStart"/>
+      <w:r>
+        <w:rPr>
+          <w:rFonts w:ascii="Times New Roman" w:eastAsia="Times New Roman" w:hAnsi="Times New Roman" w:cs="Times New Roman"/>
+          <w:kern w:val="0"/>
+          <w:lang w:eastAsia="hu-HU"/>
+          <w14:ligatures w14:val="none"/>
+        </w:rPr>
+        <w:t>Bearer</w:t>
+      </w:r>
+      <w:proofErr w:type="spellEnd"/>
+      <w:r>
+        <w:rPr>
+          <w:rFonts w:ascii="Times New Roman" w:eastAsia="Times New Roman" w:hAnsi="Times New Roman" w:cs="Times New Roman"/>
+          <w:kern w:val="0"/>
+          <w:lang w:eastAsia="hu-HU"/>
+          <w14:ligatures w14:val="none"/>
+        </w:rPr>
+        <w:t xml:space="preserve"> </w:t>
+      </w:r>
+      <w:proofErr w:type="spellStart"/>
+      <w:r>
+        <w:rPr>
+          <w:rFonts w:ascii="Times New Roman" w:eastAsia="Times New Roman" w:hAnsi="Times New Roman" w:cs="Times New Roman"/>
+          <w:kern w:val="0"/>
+          <w:lang w:eastAsia="hu-HU"/>
+          <w14:ligatures w14:val="none"/>
+        </w:rPr>
+        <w:t>Token</w:t>
+      </w:r>
+      <w:proofErr w:type="spellEnd"/>
+      <w:r>
+        <w:rPr>
+          <w:rFonts w:ascii="Times New Roman" w:eastAsia="Times New Roman" w:hAnsi="Times New Roman" w:cs="Times New Roman"/>
+          <w:kern w:val="0"/>
+          <w:lang w:eastAsia="hu-HU"/>
+          <w14:ligatures w14:val="none"/>
+        </w:rPr>
+        <w:t>)</w:t>
+      </w:r>
+    </w:p>
+    <w:p>
+      <w:pPr>
+        <w:numPr>
+          <w:ilvl w:val="0"/>
+          <w:numId w:val="2"/>
+        </w:numPr>
+        <w:spacing w:before="100" w:beforeAutospacing="1" w:after="100" w:afterAutospacing="1" w:line="240" w:lineRule="auto"/>
+        <w:rPr>
+          <w:rFonts w:ascii="Times New Roman" w:eastAsia="Times New Roman" w:hAnsi="Times New Roman" w:cs="Times New Roman"/>
+          <w:kern w:val="0"/>
+          <w:lang w:eastAsia="hu-HU"/>
+          <w14:ligatures w14:val="none"/>
+        </w:rPr>
+      </w:pPr>
+      <w:r>
+        <w:rPr>
+          <w:rFonts w:ascii="Times New Roman" w:eastAsia="Times New Roman" w:hAnsi="Times New Roman" w:cs="Times New Roman"/>
+          <w:b/>
+          <w:bCs/>
+          <w:kern w:val="0"/>
+          <w:lang w:eastAsia="hu-HU"/>
+          <w14:ligatures w14:val="none"/>
+        </w:rPr>
+        <w:t>Adatbázis:</w:t>
+      </w:r>
+      <w:r>
+        <w:rPr>
+          <w:rFonts w:ascii="Times New Roman" w:eastAsia="Times New Roman" w:hAnsi="Times New Roman" w:cs="Times New Roman"/>
+          <w:kern w:val="0"/>
+          <w:lang w:eastAsia="hu-HU"/>
+          <w14:ligatures w14:val="none"/>
+        </w:rPr>
+        <w:t xml:space="preserve"> </w:t>
+      </w:r>
+      <w:proofErr w:type="spellStart"/>
+      <w:r>
+        <w:rPr>
+          <w:rFonts w:ascii="Times New Roman" w:eastAsia="Times New Roman" w:hAnsi="Times New Roman" w:cs="Times New Roman"/>
+          <w:kern w:val="0"/>
+          <w:lang w:eastAsia="hu-HU"/>
+          <w14:ligatures w14:val="none"/>
+        </w:rPr>
+        <w:t>MySQL</w:t>
+      </w:r>
+      <w:proofErr w:type="spellEnd"/>
+      <w:r>
+        <w:rPr>
+          <w:rFonts w:ascii="Times New Roman" w:eastAsia="Times New Roman" w:hAnsi="Times New Roman" w:cs="Times New Roman"/>
+          <w:kern w:val="0"/>
+          <w:lang w:eastAsia="hu-HU"/>
+          <w14:ligatures w14:val="none"/>
+        </w:rPr>
+        <w:t xml:space="preserve"> / </w:t>
+      </w:r>
+      <w:proofErr w:type="spellStart"/>
+      <w:r>
+        <w:rPr>
+          <w:rFonts w:ascii="Times New Roman" w:eastAsia="Times New Roman" w:hAnsi="Times New Roman" w:cs="Times New Roman"/>
+          <w:kern w:val="0"/>
+          <w:lang w:eastAsia="hu-HU"/>
+          <w14:ligatures w14:val="none"/>
+        </w:rPr>
+        <w:t>MariaDB</w:t>
+      </w:r>
+      <w:proofErr w:type="spellEnd"/>
+      <w:r>
+        <w:rPr>
+          <w:rFonts w:ascii="Times New Roman" w:eastAsia="Times New Roman" w:hAnsi="Times New Roman" w:cs="Times New Roman"/>
+          <w:kern w:val="0"/>
+          <w:lang w:eastAsia="hu-HU"/>
+          <w14:ligatures w14:val="none"/>
+        </w:rPr>
+        <w:t xml:space="preserve"> / </w:t>
+      </w:r>
+      <w:proofErr w:type="spellStart"/>
+      <w:r>
+        <w:rPr>
+          <w:rFonts w:ascii="Times New Roman" w:eastAsia="Times New Roman" w:hAnsi="Times New Roman" w:cs="Times New Roman"/>
+          <w:kern w:val="0"/>
+          <w:lang w:eastAsia="hu-HU"/>
+          <w14:ligatures w14:val="none"/>
+        </w:rPr>
+        <w:t>SQLite</w:t>
+      </w:r>
+      <w:proofErr w:type="spellEnd"/>
+    </w:p>
+    <w:p>
+      <w:pPr>
+        <w:numPr>
+          <w:ilvl w:val="0"/>
+          <w:numId w:val="2"/>
+        </w:numPr>
+        <w:spacing w:before="100" w:beforeAutospacing="1" w:after="100" w:afterAutospacing="1" w:line="240" w:lineRule="auto"/>
+        <w:rPr>
+          <w:rFonts w:ascii="Times New Roman" w:eastAsia="Times New Roman" w:hAnsi="Times New Roman" w:cs="Times New Roman"/>
+          <w:kern w:val="0"/>
+          <w:lang w:eastAsia="hu-HU"/>
+          <w14:ligatures w14:val="none"/>
+        </w:rPr>
+      </w:pPr>
+      <w:r>
+        <w:rPr>
+          <w:rFonts w:ascii="Times New Roman" w:eastAsia="Times New Roman" w:hAnsi="Times New Roman" w:cs="Times New Roman"/>
+          <w:b/>
+          <w:bCs/>
+          <w:kern w:val="0"/>
+          <w:lang w:eastAsia="hu-HU"/>
+          <w14:ligatures w14:val="none"/>
+        </w:rPr>
+        <w:t>API prefix:</w:t>
+      </w:r>
+      <w:r>
+        <w:rPr>
+          <w:rFonts w:ascii="Times New Roman" w:eastAsia="Times New Roman" w:hAnsi="Times New Roman" w:cs="Times New Roman"/>
+          <w:kern w:val="0"/>
+          <w:lang w:eastAsia="hu-HU"/>
+          <w14:ligatures w14:val="none"/>
+        </w:rPr>
+        <w:t xml:space="preserve"> </w:t>
+      </w:r>
+      <w:r>
+        <w:rPr>
+          <w:rFonts w:ascii="Courier New" w:eastAsia="Times New Roman" w:hAnsi="Courier New" w:cs="Courier New"/>
+          <w:kern w:val="0"/>
+          <w:sz w:val="20"/>
+          <w:szCs w:val="20"/>
+          <w:lang w:eastAsia="hu-HU"/>
+          <w14:ligatures w14:val="none"/>
+        </w:rPr>
+        <w:t>/</w:t>
+      </w:r>
+      <w:proofErr w:type="spellStart"/>
+      <w:r>
+        <w:rPr>
+          <w:rFonts w:ascii="Courier New" w:eastAsia="Times New Roman" w:hAnsi="Courier New" w:cs="Courier New"/>
+          <w:kern w:val="0"/>
+          <w:sz w:val="20"/>
+          <w:szCs w:val="20"/>
+          <w:lang w:eastAsia="hu-HU"/>
+          <w14:ligatures w14:val="none"/>
+        </w:rPr>
+        <w:t>api</w:t>
+      </w:r>
+      <w:proofErr w:type="spellEnd"/>
+    </w:p>
+    <w:p>
+      <w:pPr>
+        <w:numPr>
+          <w:ilvl w:val="0"/>
+          <w:numId w:val="2"/>
+        </w:numPr>
+        <w:spacing w:before="100" w:beforeAutospacing="1" w:after="100" w:afterAutospacing="1" w:line="240" w:lineRule="auto"/>
+        <w:rPr>
+          <w:rFonts w:ascii="Times New Roman" w:eastAsia="Times New Roman" w:hAnsi="Times New Roman" w:cs="Times New Roman"/>
+          <w:kern w:val="0"/>
+          <w:lang w:eastAsia="hu-HU"/>
+          <w14:ligatures w14:val="none"/>
+        </w:rPr>
+      </w:pPr>
+      <w:r>
+        <w:rPr>
+          <w:rFonts w:ascii="Times New Roman" w:eastAsia="Times New Roman" w:hAnsi="Times New Roman" w:cs="Times New Roman"/>
+          <w:b/>
+          <w:bCs/>
+          <w:kern w:val="0"/>
+          <w:lang w:eastAsia="hu-HU"/>
+          <w14:ligatures w14:val="none"/>
+        </w:rPr>
+        <w:t>Fejlesztői URL:</w:t>
+      </w:r>
+      <w:r>
+        <w:rPr>
+          <w:rFonts w:ascii="Times New Roman" w:eastAsia="Times New Roman" w:hAnsi="Times New Roman" w:cs="Times New Roman"/>
+          <w:kern w:val="0"/>
+          <w:lang w:eastAsia="hu-HU"/>
+          <w14:ligatures w14:val="none"/>
+        </w:rPr>
+        <w:t xml:space="preserve"> </w:t>
+      </w:r>
+      <w:r>
+        <w:rPr>
+          <w:rFonts w:ascii="Courier New" w:eastAsia="Times New Roman" w:hAnsi="Courier New" w:cs="Courier New"/>
+          <w:kern w:val="0"/>
+          <w:sz w:val="20"/>
+          <w:szCs w:val="20"/>
+          <w:lang w:eastAsia="hu-HU"/>
+          <w14:ligatures w14:val="none"/>
+        </w:rPr>
+        <w:t>http://localhost:8000/api</w:t>
+      </w:r>
+    </w:p>
+    <w:p>
+      <w:pPr>
+        <w:spacing w:after="0" w:line="240" w:lineRule="auto"/>
+        <w:rPr>
+          <w:rFonts w:ascii="Times New Roman" w:eastAsia="Times New Roman" w:hAnsi="Times New Roman" w:cs="Times New Roman"/>
+          <w:kern w:val="0"/>
+          <w:lang w:eastAsia="hu-HU"/>
+          <w14:ligatures w14:val="none"/>
+        </w:rPr>
+      </w:pPr>
+      <w:r>
+        <w:rPr>
+          <w:rFonts w:ascii="Times New Roman" w:eastAsia="Times New Roman" w:hAnsi="Times New Roman" w:cs="Times New Roman"/>
+          <w:kern w:val="0"/>
+          <w:lang w:eastAsia="hu-HU"/>
+          <w14:ligatures w14:val="none"/>
+        </w:rPr>
+        <w:pict w14:anchorId="1B4FAF07">
+          <v:rect id="_x0000_i1026" style="width:0;height:1.5pt" o:hralign="center" o:hrstd="t" o:hr="t" fillcolor="#a0a0a0" stroked="f"/>
+        </w:pict>
+      </w:r>
+    </w:p>
+    <w:p>
+      <w:pPr>
+        <w:spacing w:before="100" w:beforeAutospacing="1" w:after="100" w:afterAutospacing="1" w:line="240" w:lineRule="auto"/>
+        <w:outlineLvl w:val="2"/>
+        <w:rPr>
+          <w:rFonts w:ascii="Times New Roman" w:eastAsia="Times New Roman" w:hAnsi="Times New Roman" w:cs="Times New Roman"/>
+          <w:b/>
+          <w:bCs/>
+          <w:kern w:val="0"/>
+          <w:sz w:val="27"/>
+          <w:szCs w:val="27"/>
+          <w:lang w:eastAsia="hu-HU"/>
+          <w14:ligatures w14:val="none"/>
+        </w:rPr>
+      </w:pPr>
+      <w:r>
+        <w:rPr>
+          <w:rFonts w:ascii="Times New Roman" w:eastAsia="Times New Roman" w:hAnsi="Times New Roman" w:cs="Times New Roman"/>
+          <w:b/>
+          <w:bCs/>
+          <w:kern w:val="0"/>
+          <w:sz w:val="27"/>
+          <w:szCs w:val="27"/>
+          <w:lang w:eastAsia="hu-HU"/>
+          <w14:ligatures w14:val="none"/>
+        </w:rPr>
+        <w:t>1.3 Általános szabályok</w:t>
+      </w:r>
+    </w:p>
+    <w:p>
+      <w:pPr>
+        <w:spacing w:before="100" w:beforeAutospacing="1" w:after="100" w:afterAutospacing="1" w:line="240" w:lineRule="auto"/>
+        <w:rPr>
+          <w:rFonts w:ascii="Times New Roman" w:eastAsia="Times New Roman" w:hAnsi="Times New Roman" w:cs="Times New Roman"/>
+          <w:kern w:val="0"/>
+          <w:lang w:eastAsia="hu-HU"/>
+          <w14:ligatures w14:val="none"/>
+        </w:rPr>
+      </w:pPr>
+      <w:proofErr w:type="spellStart"/>
+      <w:r>
+        <w:rPr>
+          <w:rFonts w:ascii="Times New Roman" w:eastAsia="Times New Roman" w:hAnsi="Times New Roman" w:cs="Times New Roman"/>
+          <w:b/>
+          <w:bCs/>
+          <w:kern w:val="0"/>
+          <w:lang w:eastAsia="hu-HU"/>
+          <w14:ligatures w14:val="none"/>
+        </w:rPr>
+        <w:t>Base</w:t>
+      </w:r>
+      <w:proofErr w:type="spellEnd"/>
+      <w:r>
+        <w:rPr>
+          <w:rFonts w:ascii="Times New Roman" w:eastAsia="Times New Roman" w:hAnsi="Times New Roman" w:cs="Times New Roman"/>
+          <w:b/>
+          <w:bCs/>
+          <w:kern w:val="0"/>
+          <w:lang w:eastAsia="hu-HU"/>
+          <w14:ligatures w14:val="none"/>
+        </w:rPr>
+        <w:t xml:space="preserve"> URL (fejlesztés):</w:t>
+      </w:r>
+      <w:r>
+        <w:rPr>
+          <w:rFonts w:ascii="Times New Roman" w:eastAsia="Times New Roman" w:hAnsi="Times New Roman" w:cs="Times New Roman"/>
+          <w:kern w:val="0"/>
+          <w:lang w:eastAsia="hu-HU"/>
+          <w14:ligatures w14:val="none"/>
+        </w:rPr>
+        <w:br/>
+      </w:r>
+      <w:r>
+        <w:rPr>
+          <w:rFonts w:ascii="Courier New" w:eastAsia="Times New Roman" w:hAnsi="Courier New" w:cs="Courier New"/>
+          <w:kern w:val="0"/>
+          <w:sz w:val="20"/>
+          <w:szCs w:val="20"/>
+          <w:lang w:eastAsia="hu-HU"/>
+          <w14:ligatures w14:val="none"/>
+        </w:rPr>
+        <w:t>http://localhost:8000/api</w:t>
+      </w:r>
+    </w:p>
+    <w:p>
+      <w:pPr>
+        <w:spacing w:before="100" w:beforeAutospacing="1" w:after="100" w:afterAutospacing="1" w:line="240" w:lineRule="auto"/>
+        <w:rPr>
+          <w:rFonts w:ascii="Times New Roman" w:eastAsia="Times New Roman" w:hAnsi="Times New Roman" w:cs="Times New Roman"/>
+          <w:kern w:val="0"/>
+          <w:lang w:eastAsia="hu-HU"/>
+          <w14:ligatures w14:val="none"/>
+        </w:rPr>
+      </w:pPr>
+      <w:r>
+        <w:rPr>
+          <w:rFonts w:ascii="Times New Roman" w:eastAsia="Times New Roman" w:hAnsi="Times New Roman" w:cs="Times New Roman"/>
+          <w:kern w:val="0"/>
+          <w:lang w:eastAsia="hu-HU"/>
+          <w14:ligatures w14:val="none"/>
+        </w:rPr>
+        <w:t xml:space="preserve">Minden védett </w:t>
+      </w:r>
+      <w:proofErr w:type="spellStart"/>
+      <w:r>
+        <w:rPr>
+          <w:rFonts w:ascii="Times New Roman" w:eastAsia="Times New Roman" w:hAnsi="Times New Roman" w:cs="Times New Roman"/>
+          <w:kern w:val="0"/>
+          <w:lang w:eastAsia="hu-HU"/>
+          <w14:ligatures w14:val="none"/>
+        </w:rPr>
+        <w:t>endpoint</w:t>
+      </w:r>
+      <w:proofErr w:type="spellEnd"/>
+      <w:r>
+        <w:rPr>
+          <w:rFonts w:ascii="Times New Roman" w:eastAsia="Times New Roman" w:hAnsi="Times New Roman" w:cs="Times New Roman"/>
+          <w:kern w:val="0"/>
+          <w:lang w:eastAsia="hu-HU"/>
+          <w14:ligatures w14:val="none"/>
+        </w:rPr>
+        <w:t xml:space="preserve"> esetén szükséges HTTP </w:t>
+      </w:r>
+      <w:proofErr w:type="spellStart"/>
+      <w:r>
+        <w:rPr>
+          <w:rFonts w:ascii="Times New Roman" w:eastAsia="Times New Roman" w:hAnsi="Times New Roman" w:cs="Times New Roman"/>
+          <w:kern w:val="0"/>
+          <w:lang w:eastAsia="hu-HU"/>
+          <w14:ligatures w14:val="none"/>
+        </w:rPr>
+        <w:t>header</w:t>
+      </w:r>
+      <w:proofErr w:type="spellEnd"/>
+      <w:r>
+        <w:rPr>
+          <w:rFonts w:ascii="Times New Roman" w:eastAsia="Times New Roman" w:hAnsi="Times New Roman" w:cs="Times New Roman"/>
+          <w:kern w:val="0"/>
+          <w:lang w:eastAsia="hu-HU"/>
+          <w14:ligatures w14:val="none"/>
+        </w:rPr>
+        <w:t>:</w:t>
+      </w:r>
+    </w:p>
+    <w:p>
+      <w:pPr>
+        <w:tabs>
+          <w:tab w:val="left" w:pos="916"/>
+          <w:tab w:val="left" w:pos="1832"/>
+          <w:tab w:val="left" w:pos="2748"/>
+          <w:tab w:val="left" w:pos="3664"/>
+          <w:tab w:val="left" w:pos="4580"/>
+          <w:tab w:val="left" w:pos="5496"/>
+          <w:tab w:val="left" w:pos="6412"/>
+          <w:tab w:val="left" w:pos="7328"/>
+          <w:tab w:val="left" w:pos="8244"/>
+          <w:tab w:val="left" w:pos="9160"/>
+          <w:tab w:val="left" w:pos="10076"/>
+          <w:tab w:val="left" w:pos="10992"/>
+          <w:tab w:val="left" w:pos="11908"/>
+          <w:tab w:val="left" w:pos="12824"/>
+          <w:tab w:val="left" w:pos="13740"/>
+          <w:tab w:val="left" w:pos="14656"/>
+        </w:tabs>
+        <w:spacing w:after="0" w:line="240" w:lineRule="auto"/>
+        <w:rPr>
+          <w:rFonts w:ascii="Courier New" w:eastAsia="Times New Roman" w:hAnsi="Courier New" w:cs="Courier New"/>
+          <w:kern w:val="0"/>
+          <w:sz w:val="20"/>
+          <w:szCs w:val="20"/>
+          <w:lang w:eastAsia="hu-HU"/>
+          <w14:ligatures w14:val="none"/>
+        </w:rPr>
+      </w:pPr>
+      <w:proofErr w:type="spellStart"/>
+      <w:r>
+        <w:rPr>
+          <w:rFonts w:ascii="Courier New" w:eastAsia="Times New Roman" w:hAnsi="Courier New" w:cs="Courier New"/>
+          <w:kern w:val="0"/>
+          <w:sz w:val="20"/>
+          <w:szCs w:val="20"/>
+          <w:lang w:eastAsia="hu-HU"/>
+          <w14:ligatures w14:val="none"/>
+        </w:rPr>
+        <w:t>Authorization</w:t>
+      </w:r>
+      <w:proofErr w:type="spellEnd"/>
+      <w:r>
+        <w:rPr>
+          <w:rFonts w:ascii="Courier New" w:eastAsia="Times New Roman" w:hAnsi="Courier New" w:cs="Courier New"/>
+          <w:kern w:val="0"/>
+          <w:sz w:val="20"/>
+          <w:szCs w:val="20"/>
+          <w:lang w:eastAsia="hu-HU"/>
+          <w14:ligatures w14:val="none"/>
+        </w:rPr>
+        <w:t xml:space="preserve">: </w:t>
+      </w:r>
+      <w:proofErr w:type="spellStart"/>
+      <w:r>
+        <w:rPr>
+          <w:rFonts w:ascii="Courier New" w:eastAsia="Times New Roman" w:hAnsi="Courier New" w:cs="Courier New"/>
+          <w:kern w:val="0"/>
+          <w:sz w:val="20"/>
+          <w:szCs w:val="20"/>
+          <w:lang w:eastAsia="hu-HU"/>
+          <w14:ligatures w14:val="none"/>
+        </w:rPr>
+        <w:t>Bearer</w:t>
+      </w:r>
+      <w:proofErr w:type="spellEnd"/>
+      <w:r>
+        <w:rPr>
+          <w:rFonts w:ascii="Courier New" w:eastAsia="Times New Roman" w:hAnsi="Courier New" w:cs="Courier New"/>
+          <w:kern w:val="0"/>
+          <w:sz w:val="20"/>
+          <w:szCs w:val="20"/>
+          <w:lang w:eastAsia="hu-HU"/>
+          <w14:ligatures w14:val="none"/>
+        </w:rPr>
+        <w:t xml:space="preserve"> &lt;</w:t>
+      </w:r>
+      <w:proofErr w:type="spellStart"/>
+      <w:r>
+        <w:rPr>
+          <w:rFonts w:ascii="Courier New" w:eastAsia="Times New Roman" w:hAnsi="Courier New" w:cs="Courier New"/>
+          <w:kern w:val="0"/>
+          <w:sz w:val="20"/>
+          <w:szCs w:val="20"/>
+          <w:lang w:eastAsia="hu-HU"/>
+          <w14:ligatures w14:val="none"/>
+        </w:rPr>
+        <w:t>token</w:t>
+      </w:r>
+      <w:proofErr w:type="spellEnd"/>
+      <w:r>
+        <w:rPr>
+          <w:rFonts w:ascii="Courier New" w:eastAsia="Times New Roman" w:hAnsi="Courier New" w:cs="Courier New"/>
+          <w:kern w:val="0"/>
+          <w:sz w:val="20"/>
+          <w:szCs w:val="20"/>
+          <w:lang w:eastAsia="hu-HU"/>
+          <w14:ligatures w14:val="none"/>
+        </w:rPr>
+        <w:t>&gt;</w:t>
+      </w:r>
+    </w:p>
+    <w:p>
+      <w:pPr>
+        <w:spacing w:before="100" w:beforeAutospacing="1" w:after="100" w:afterAutospacing="1" w:line="240" w:lineRule="auto"/>
+        <w:rPr>
+          <w:rFonts w:ascii="Times New Roman" w:eastAsia="Times New Roman" w:hAnsi="Times New Roman" w:cs="Times New Roman"/>
+          <w:kern w:val="0"/>
+          <w:lang w:eastAsia="hu-HU"/>
+          <w14:ligatures w14:val="none"/>
+        </w:rPr>
+      </w:pPr>
+      <w:r>
+        <w:rPr>
+          <w:rFonts w:ascii="Times New Roman" w:eastAsia="Times New Roman" w:hAnsi="Times New Roman" w:cs="Times New Roman"/>
+          <w:b/>
+          <w:bCs/>
+          <w:kern w:val="0"/>
+          <w:lang w:eastAsia="hu-HU"/>
+          <w14:ligatures w14:val="none"/>
+        </w:rPr>
+        <w:t>Hibaválasz formátuma (401, 403, 422 stb.):</w:t>
+      </w:r>
+    </w:p>
+    <w:p>
+      <w:pPr>
+        <w:tabs>
+          <w:tab w:val="left" w:pos="916"/>
+          <w:tab w:val="left" w:pos="1832"/>
+          <w:tab w:val="left" w:pos="2748"/>
+          <w:tab w:val="left" w:pos="3664"/>
+          <w:tab w:val="left" w:pos="4580"/>
+          <w:tab w:val="left" w:pos="5496"/>
+          <w:tab w:val="left" w:pos="6412"/>
+          <w:tab w:val="left" w:pos="7328"/>
+          <w:tab w:val="left" w:pos="8244"/>
+          <w:tab w:val="left" w:pos="9160"/>
+          <w:tab w:val="left" w:pos="10076"/>
+          <w:tab w:val="left" w:pos="10992"/>
+          <w:tab w:val="left" w:pos="11908"/>
+          <w:tab w:val="left" w:pos="12824"/>
+          <w:tab w:val="left" w:pos="13740"/>
+          <w:tab w:val="left" w:pos="14656"/>
+        </w:tabs>
+        <w:spacing w:after="0" w:line="240" w:lineRule="auto"/>
+        <w:rPr>
+          <w:rFonts w:ascii="Courier New" w:eastAsia="Times New Roman" w:hAnsi="Courier New" w:cs="Courier New"/>
+          <w:kern w:val="0"/>
+          <w:sz w:val="20"/>
+          <w:szCs w:val="20"/>
+          <w:lang w:eastAsia="hu-HU"/>
+          <w14:ligatures w14:val="none"/>
+        </w:rPr>
+      </w:pPr>
+      <w:r>
+        <w:rPr>
+          <w:rFonts w:ascii="Courier New" w:eastAsia="Times New Roman" w:hAnsi="Courier New" w:cs="Courier New"/>
+          <w:kern w:val="0"/>
+          <w:sz w:val="20"/>
+          <w:szCs w:val="20"/>
+          <w:lang w:eastAsia="hu-HU"/>
+          <w14:ligatures w14:val="none"/>
+        </w:rPr>
+        <w:t>{</w:t>
+      </w:r>
+    </w:p>
+    <w:p>
+      <w:pPr>
+        <w:tabs>
+          <w:tab w:val="left" w:pos="916"/>
+          <w:tab w:val="left" w:pos="1832"/>
+          <w:tab w:val="left" w:pos="2748"/>
+          <w:tab w:val="left" w:pos="3664"/>
+          <w:tab w:val="left" w:pos="4580"/>
+          <w:tab w:val="left" w:pos="5496"/>
+          <w:tab w:val="left" w:pos="6412"/>
+          <w:tab w:val="left" w:pos="7328"/>
+          <w:tab w:val="left" w:pos="8244"/>
+          <w:tab w:val="left" w:pos="9160"/>
+          <w:tab w:val="left" w:pos="10076"/>
+          <w:tab w:val="left" w:pos="10992"/>
+          <w:tab w:val="left" w:pos="11908"/>
+          <w:tab w:val="left" w:pos="12824"/>
+          <w:tab w:val="left" w:pos="13740"/>
+          <w:tab w:val="left" w:pos="14656"/>
+        </w:tabs>
+        <w:spacing w:after="0" w:line="240" w:lineRule="auto"/>
+        <w:rPr>
+          <w:rFonts w:ascii="Courier New" w:eastAsia="Times New Roman" w:hAnsi="Courier New" w:cs="Courier New"/>
+          <w:kern w:val="0"/>
+          <w:sz w:val="20"/>
+          <w:szCs w:val="20"/>
+          <w:lang w:eastAsia="hu-HU"/>
+          <w14:ligatures w14:val="none"/>
+        </w:rPr>
+      </w:pPr>
+      <w:r>
+        <w:rPr>
+          <w:rFonts w:ascii="Courier New" w:eastAsia="Times New Roman" w:hAnsi="Courier New" w:cs="Courier New"/>
+          <w:kern w:val="0"/>
+          <w:sz w:val="20"/>
+          <w:szCs w:val="20"/>
+          <w:lang w:eastAsia="hu-HU"/>
+          <w14:ligatures w14:val="none"/>
+        </w:rPr>
+        <w:t xml:space="preserve">  "</w:t>
+      </w:r>
+      <w:proofErr w:type="spellStart"/>
+      <w:r>
+        <w:rPr>
+          <w:rFonts w:ascii="Courier New" w:eastAsia="Times New Roman" w:hAnsi="Courier New" w:cs="Courier New"/>
+          <w:kern w:val="0"/>
+          <w:sz w:val="20"/>
+          <w:szCs w:val="20"/>
+          <w:lang w:eastAsia="hu-HU"/>
+          <w14:ligatures w14:val="none"/>
+        </w:rPr>
+        <w:t>message</w:t>
+      </w:r>
+      <w:proofErr w:type="spellEnd"/>
+      <w:r>
+        <w:rPr>
+          <w:rFonts w:ascii="Courier New" w:eastAsia="Times New Roman" w:hAnsi="Courier New" w:cs="Courier New"/>
+          <w:kern w:val="0"/>
+          <w:sz w:val="20"/>
+          <w:szCs w:val="20"/>
+          <w:lang w:eastAsia="hu-HU"/>
+          <w14:ligatures w14:val="none"/>
+        </w:rPr>
+        <w:t>": "Hibaüzenet",</w:t>
+      </w:r>
+    </w:p>
+    <w:p>
+      <w:pPr>
+        <w:tabs>
+          <w:tab w:val="left" w:pos="916"/>
+          <w:tab w:val="left" w:pos="1832"/>
+          <w:tab w:val="left" w:pos="2748"/>
+          <w:tab w:val="left" w:pos="3664"/>
+          <w:tab w:val="left" w:pos="4580"/>
+          <w:tab w:val="left" w:pos="5496"/>
+          <w:tab w:val="left" w:pos="6412"/>
+          <w:tab w:val="left" w:pos="7328"/>
+          <w:tab w:val="left" w:pos="8244"/>
+          <w:tab w:val="left" w:pos="9160"/>
+          <w:tab w:val="left" w:pos="10076"/>
+          <w:tab w:val="left" w:pos="10992"/>
+          <w:tab w:val="left" w:pos="11908"/>
+          <w:tab w:val="left" w:pos="12824"/>
+          <w:tab w:val="left" w:pos="13740"/>
+          <w:tab w:val="left" w:pos="14656"/>
+        </w:tabs>
+        <w:spacing w:after="0" w:line="240" w:lineRule="auto"/>
+        <w:rPr>
+          <w:rFonts w:ascii="Courier New" w:eastAsia="Times New Roman" w:hAnsi="Courier New" w:cs="Courier New"/>
+          <w:kern w:val="0"/>
+          <w:sz w:val="20"/>
+          <w:szCs w:val="20"/>
+          <w:lang w:eastAsia="hu-HU"/>
+          <w14:ligatures w14:val="none"/>
+        </w:rPr>
+      </w:pPr>
+      <w:r>
+        <w:rPr>
+          <w:rFonts w:ascii="Courier New" w:eastAsia="Times New Roman" w:hAnsi="Courier New" w:cs="Courier New"/>
+          <w:kern w:val="0"/>
+          <w:sz w:val="20"/>
+          <w:szCs w:val="20"/>
+          <w:lang w:eastAsia="hu-HU"/>
+          <w14:ligatures w14:val="none"/>
+        </w:rPr>
+        <w:t xml:space="preserve">  "</w:t>
+      </w:r>
+      <w:proofErr w:type="spellStart"/>
+      <w:r>
+        <w:rPr>
+          <w:rFonts w:ascii="Courier New" w:eastAsia="Times New Roman" w:hAnsi="Courier New" w:cs="Courier New"/>
+          <w:kern w:val="0"/>
+          <w:sz w:val="20"/>
+          <w:szCs w:val="20"/>
+          <w:lang w:eastAsia="hu-HU"/>
+          <w14:ligatures w14:val="none"/>
+        </w:rPr>
+        <w:t>errors</w:t>
+      </w:r>
+      <w:proofErr w:type="spellEnd"/>
+      <w:r>
+        <w:rPr>
+          <w:rFonts w:ascii="Courier New" w:eastAsia="Times New Roman" w:hAnsi="Courier New" w:cs="Courier New"/>
+          <w:kern w:val="0"/>
+          <w:sz w:val="20"/>
+          <w:szCs w:val="20"/>
+          <w:lang w:eastAsia="hu-HU"/>
+          <w14:ligatures w14:val="none"/>
+        </w:rPr>
+        <w:t>": {</w:t>
+      </w:r>
+    </w:p>
+    <w:p>
+      <w:pPr>
+        <w:tabs>
+          <w:tab w:val="left" w:pos="916"/>
+          <w:tab w:val="left" w:pos="1832"/>
+          <w:tab w:val="left" w:pos="2748"/>
+          <w:tab w:val="left" w:pos="3664"/>
+          <w:tab w:val="left" w:pos="4580"/>
+          <w:tab w:val="left" w:pos="5496"/>
+          <w:tab w:val="left" w:pos="6412"/>
+          <w:tab w:val="left" w:pos="7328"/>
+          <w:tab w:val="left" w:pos="8244"/>
+          <w:tab w:val="left" w:pos="9160"/>
+          <w:tab w:val="left" w:pos="10076"/>
+          <w:tab w:val="left" w:pos="10992"/>
+          <w:tab w:val="left" w:pos="11908"/>
+          <w:tab w:val="left" w:pos="12824"/>
+          <w:tab w:val="left" w:pos="13740"/>
+          <w:tab w:val="left" w:pos="14656"/>
+        </w:tabs>
+        <w:spacing w:after="0" w:line="240" w:lineRule="auto"/>
+        <w:rPr>
+          <w:rFonts w:ascii="Courier New" w:eastAsia="Times New Roman" w:hAnsi="Courier New" w:cs="Courier New"/>
+          <w:kern w:val="0"/>
+          <w:sz w:val="20"/>
+          <w:szCs w:val="20"/>
+          <w:lang w:eastAsia="hu-HU"/>
+          <w14:ligatures w14:val="none"/>
+        </w:rPr>
+      </w:pPr>
+      <w:r>
+        <w:rPr>
+          <w:rFonts w:ascii="Courier New" w:eastAsia="Times New Roman" w:hAnsi="Courier New" w:cs="Courier New"/>
+          <w:kern w:val="0"/>
+          <w:sz w:val="20"/>
+          <w:szCs w:val="20"/>
+          <w:lang w:eastAsia="hu-HU"/>
+          <w14:ligatures w14:val="none"/>
+        </w:rPr>
+        <w:t xml:space="preserve">    "mező": ["első hiba", "másik hiba"]</w:t>
+      </w:r>
+    </w:p>
+    <w:p>
+      <w:pPr>
+        <w:tabs>
+          <w:tab w:val="left" w:pos="916"/>
+          <w:tab w:val="left" w:pos="1832"/>
+          <w:tab w:val="left" w:pos="2748"/>
+          <w:tab w:val="left" w:pos="3664"/>
+          <w:tab w:val="left" w:pos="4580"/>
+          <w:tab w:val="left" w:pos="5496"/>
+          <w:tab w:val="left" w:pos="6412"/>
+          <w:tab w:val="left" w:pos="7328"/>
+          <w:tab w:val="left" w:pos="8244"/>
+          <w:tab w:val="left" w:pos="9160"/>
+          <w:tab w:val="left" w:pos="10076"/>
+          <w:tab w:val="left" w:pos="10992"/>
+          <w:tab w:val="left" w:pos="11908"/>
+          <w:tab w:val="left" w:pos="12824"/>
+          <w:tab w:val="left" w:pos="13740"/>
+          <w:tab w:val="left" w:pos="14656"/>
+        </w:tabs>
+        <w:spacing w:after="0" w:line="240" w:lineRule="auto"/>
+        <w:rPr>
+          <w:rFonts w:ascii="Courier New" w:eastAsia="Times New Roman" w:hAnsi="Courier New" w:cs="Courier New"/>
+          <w:kern w:val="0"/>
+          <w:sz w:val="20"/>
+          <w:szCs w:val="20"/>
+          <w:lang w:eastAsia="hu-HU"/>
+          <w14:ligatures w14:val="none"/>
+        </w:rPr>
+      </w:pPr>
+      <w:r>
+        <w:rPr>
+          <w:rFonts w:ascii="Courier New" w:eastAsia="Times New Roman" w:hAnsi="Courier New" w:cs="Courier New"/>
+          <w:kern w:val="0"/>
+          <w:sz w:val="20"/>
+          <w:szCs w:val="20"/>
+          <w:lang w:eastAsia="hu-HU"/>
+          <w14:ligatures w14:val="none"/>
+        </w:rPr>
+        <w:t xml:space="preserve">  }</w:t>
+      </w:r>
+    </w:p>
+    <w:p>
+      <w:pPr>
+        <w:tabs>
+          <w:tab w:val="left" w:pos="916"/>
+          <w:tab w:val="left" w:pos="1832"/>
+          <w:tab w:val="left" w:pos="2748"/>
+          <w:tab w:val="left" w:pos="3664"/>
+          <w:tab w:val="left" w:pos="4580"/>
+          <w:tab w:val="left" w:pos="5496"/>
+          <w:tab w:val="left" w:pos="6412"/>
+          <w:tab w:val="left" w:pos="7328"/>
+          <w:tab w:val="left" w:pos="8244"/>
+          <w:tab w:val="left" w:pos="9160"/>
+          <w:tab w:val="left" w:pos="10076"/>
+          <w:tab w:val="left" w:pos="10992"/>
+          <w:tab w:val="left" w:pos="11908"/>
+          <w:tab w:val="left" w:pos="12824"/>
+          <w:tab w:val="left" w:pos="13740"/>
+          <w:tab w:val="left" w:pos="14656"/>
+        </w:tabs>
+        <w:spacing w:after="0" w:line="240" w:lineRule="auto"/>
+        <w:rPr>
+          <w:rFonts w:ascii="Courier New" w:eastAsia="Times New Roman" w:hAnsi="Courier New" w:cs="Courier New"/>
+          <w:kern w:val="0"/>
+          <w:sz w:val="20"/>
+          <w:szCs w:val="20"/>
+          <w:lang w:eastAsia="hu-HU"/>
+          <w14:ligatures w14:val="none"/>
+        </w:rPr>
+      </w:pPr>
+      <w:r>
+        <w:rPr>
+          <w:rFonts w:ascii="Courier New" w:eastAsia="Times New Roman" w:hAnsi="Courier New" w:cs="Courier New"/>
+          <w:kern w:val="0"/>
+          <w:sz w:val="20"/>
+          <w:szCs w:val="20"/>
+          <w:lang w:eastAsia="hu-HU"/>
+          <w14:ligatures w14:val="none"/>
+        </w:rPr>
+        <w:t>}</w:t>
+      </w:r>
+    </w:p>
     <w:p/>
     <w:sectPr>
       <w:pgSz w:w="11906" w:h="16838"/>
-      <w:pgMar w:top="1417" w:right="1417" w:bottom="1417" w:left="1417" w:header="708" w:footer="708" w:gutter="0"/>
+      <w:pgMar w:top="720" w:right="720" w:bottom="720" w:left="720" w:header="708" w:footer="708" w:gutter="0"/>
       <w:cols w:space="708"/>
       <w:docGrid w:linePitch="360"/>
     </w:sectPr>
   </w:body>
 </w:document>
+</file>
+
+<file path=word/numbering.xml><?xml version="1.0" encoding="utf-8"?>
+<w:numbering xmlns:wpc="http://schemas.microsoft.com/office/word/2010/wordprocessingCanvas" xmlns:cx="http://schemas.microsoft.com/office/drawing/2014/chartex" xmlns:cx1="http://schemas.microsoft.com/office/drawing/2015/9/8/chartex" xmlns:cx2="http://schemas.microsoft.com/office/drawing/2015/10/21/chartex" xmlns:cx3="http://schemas.microsoft.com/office/drawing/2016/5/9/chartex" xmlns:cx4="http://schemas.microsoft.com/office/drawing/2016/5/10/chartex" xmlns:cx5="http://schemas.microsoft.com/office/drawing/2016/5/11/chartex" xmlns:cx6="http://schemas.microsoft.com/office/drawing/2016/5/12/chartex" xmlns:cx7="http://schemas.microsoft.com/office/drawing/2016/5/13/chartex" xmlns:cx8="http://schemas.microsoft.com/office/drawing/2016/5/14/chartex" xmlns:mc="http://schemas.openxmlformats.org/markup-compatibility/2006" xmlns:aink="http://schemas.microsoft.com/office/drawing/2016/ink" xmlns:am3d="http://schemas.microsoft.com/office/drawing/2017/model3d" xmlns:o="urn:schemas-microsoft-com:office:office" xmlns:oel="http://schemas.microsoft.com/office/2019/extlst" xmlns:r="http://schemas.openxmlformats.org/officeDocument/2006/relationships" xmlns:m="http://schemas.openxmlformats.org/officeDocument/2006/math" xmlns:v="urn:schemas-microsoft-com:vml" xmlns:wp14="http://schemas.microsoft.com/office/word/2010/wordprocessingDrawing" xmlns:wp="http://schemas.openxmlformats.org/drawingml/2006/wordprocessingDrawing" xmlns:w10="urn:schemas-microsoft-com:office:word" xmlns:w="http://schemas.openxmlformats.org/wordprocessingml/2006/main" xmlns:w14="http://schemas.microsoft.com/office/word/2010/wordml" xmlns:w15="http://schemas.microsoft.com/office/word/2012/wordml" xmlns:w16cex="http://schemas.microsoft.com/office/word/2018/wordml/cex" xmlns:w16cid="http://schemas.microsoft.com/office/word/2016/wordml/cid" xmlns:w16="http://schemas.microsoft.com/office/word/2018/wordml" xmlns:w16du="http://schemas.microsoft.com/office/word/2023/wordml/word16du" xmlns:w16sdtdh="http://schemas.microsoft.com/office/word/2020/wordml/sdtdatahash" xmlns:w16sdtfl="http://schemas.microsoft.com/office/word/2024/wordml/sdtformatlock" xmlns:w16se="http://schemas.microsoft.com/office/word/2015/wordml/symex" xmlns:wpg="http://schemas.microsoft.com/office/word/2010/wordprocessingGroup" xmlns:wpi="http://schemas.microsoft.com/office/word/2010/wordprocessingInk" xmlns:wne="http://schemas.microsoft.com/office/word/2006/wordml" xmlns:wps="http://schemas.microsoft.com/office/word/2010/wordprocessingShape" mc:Ignorable="w14 w15 w16se w16cid w16 w16cex w16sdtdh w16sdtfl w16du wp14">
+  <w:abstractNum w:abstractNumId="0" w15:restartNumberingAfterBreak="0">
+    <w:nsid w:val="02B75A8D"/>
+    <w:multiLevelType w:val="multilevel"/>
+    <w:tmpl w:val="5E766648"/>
+    <w:lvl w:ilvl="0">
+      <w:start w:val="1"/>
+      <w:numFmt w:val="bullet"/>
+      <w:lvlText w:val=""/>
+      <w:lvlJc w:val="left"/>
+      <w:pPr>
+        <w:tabs>
+          <w:tab w:val="num" w:pos="720"/>
+        </w:tabs>
+        <w:ind w:left="720" w:hanging="360"/>
+      </w:pPr>
+      <w:rPr>
+        <w:rFonts w:ascii="Symbol" w:hAnsi="Symbol" w:hint="default"/>
+        <w:sz w:val="20"/>
+      </w:rPr>
+    </w:lvl>
+    <w:lvl w:ilvl="1" w:tentative="1">
+      <w:start w:val="1"/>
+      <w:numFmt w:val="bullet"/>
+      <w:lvlText w:val="o"/>
+      <w:lvlJc w:val="left"/>
+      <w:pPr>
+        <w:tabs>
+          <w:tab w:val="num" w:pos="1440"/>
+        </w:tabs>
+        <w:ind w:left="1440" w:hanging="360"/>
+      </w:pPr>
+      <w:rPr>
+        <w:rFonts w:ascii="Courier New" w:hAnsi="Courier New" w:hint="default"/>
+        <w:sz w:val="20"/>
+      </w:rPr>
+    </w:lvl>
+    <w:lvl w:ilvl="2" w:tentative="1">
+      <w:start w:val="1"/>
+      <w:numFmt w:val="bullet"/>
+      <w:lvlText w:val=""/>
+      <w:lvlJc w:val="left"/>
+      <w:pPr>
+        <w:tabs>
+          <w:tab w:val="num" w:pos="2160"/>
+        </w:tabs>
+        <w:ind w:left="2160" w:hanging="360"/>
+      </w:pPr>
+      <w:rPr>
+        <w:rFonts w:ascii="Wingdings" w:hAnsi="Wingdings" w:hint="default"/>
+        <w:sz w:val="20"/>
+      </w:rPr>
+    </w:lvl>
+    <w:lvl w:ilvl="3" w:tentative="1">
+      <w:start w:val="1"/>
+      <w:numFmt w:val="bullet"/>
+      <w:lvlText w:val=""/>
+      <w:lvlJc w:val="left"/>
+      <w:pPr>
+        <w:tabs>
+          <w:tab w:val="num" w:pos="2880"/>
+        </w:tabs>
+        <w:ind w:left="2880" w:hanging="360"/>
+      </w:pPr>
+      <w:rPr>
+        <w:rFonts w:ascii="Wingdings" w:hAnsi="Wingdings" w:hint="default"/>
+        <w:sz w:val="20"/>
+      </w:rPr>
+    </w:lvl>
+    <w:lvl w:ilvl="4" w:tentative="1">
+      <w:start w:val="1"/>
+      <w:numFmt w:val="bullet"/>
+      <w:lvlText w:val=""/>
+      <w:lvlJc w:val="left"/>
+      <w:pPr>
+        <w:tabs>
+          <w:tab w:val="num" w:pos="3600"/>
+        </w:tabs>
+        <w:ind w:left="3600" w:hanging="360"/>
+      </w:pPr>
+      <w:rPr>
+        <w:rFonts w:ascii="Wingdings" w:hAnsi="Wingdings" w:hint="default"/>
+        <w:sz w:val="20"/>
+      </w:rPr>
+    </w:lvl>
+    <w:lvl w:ilvl="5" w:tentative="1">
+      <w:start w:val="1"/>
+      <w:numFmt w:val="bullet"/>
+      <w:lvlText w:val=""/>
+      <w:lvlJc w:val="left"/>
+      <w:pPr>
+        <w:tabs>
+          <w:tab w:val="num" w:pos="4320"/>
+        </w:tabs>
+        <w:ind w:left="4320" w:hanging="360"/>
+      </w:pPr>
+      <w:rPr>
+        <w:rFonts w:ascii="Wingdings" w:hAnsi="Wingdings" w:hint="default"/>
+        <w:sz w:val="20"/>
+      </w:rPr>
+    </w:lvl>
+    <w:lvl w:ilvl="6" w:tentative="1">
+      <w:start w:val="1"/>
+      <w:numFmt w:val="bullet"/>
+      <w:lvlText w:val=""/>
+      <w:lvlJc w:val="left"/>
+      <w:pPr>
+        <w:tabs>
+          <w:tab w:val="num" w:pos="5040"/>
+        </w:tabs>
+        <w:ind w:left="5040" w:hanging="360"/>
+      </w:pPr>
+      <w:rPr>
+        <w:rFonts w:ascii="Wingdings" w:hAnsi="Wingdings" w:hint="default"/>
+        <w:sz w:val="20"/>
+      </w:rPr>
+    </w:lvl>
+    <w:lvl w:ilvl="7" w:tentative="1">
+      <w:start w:val="1"/>
+      <w:numFmt w:val="bullet"/>
+      <w:lvlText w:val=""/>
+      <w:lvlJc w:val="left"/>
+      <w:pPr>
+        <w:tabs>
+          <w:tab w:val="num" w:pos="5760"/>
+        </w:tabs>
+        <w:ind w:left="5760" w:hanging="360"/>
+      </w:pPr>
+      <w:rPr>
+        <w:rFonts w:ascii="Wingdings" w:hAnsi="Wingdings" w:hint="default"/>
+        <w:sz w:val="20"/>
+      </w:rPr>
+    </w:lvl>
+    <w:lvl w:ilvl="8" w:tentative="1">
+      <w:start w:val="1"/>
+      <w:numFmt w:val="bullet"/>
+      <w:lvlText w:val=""/>
+      <w:lvlJc w:val="left"/>
+      <w:pPr>
+        <w:tabs>
+          <w:tab w:val="num" w:pos="6480"/>
+        </w:tabs>
+        <w:ind w:left="6480" w:hanging="360"/>
+      </w:pPr>
+      <w:rPr>
+        <w:rFonts w:ascii="Wingdings" w:hAnsi="Wingdings" w:hint="default"/>
+        <w:sz w:val="20"/>
+      </w:rPr>
+    </w:lvl>
+  </w:abstractNum>
+  <w:abstractNum w:abstractNumId="1" w15:restartNumberingAfterBreak="0">
+    <w:nsid w:val="40942691"/>
+    <w:multiLevelType w:val="multilevel"/>
+    <w:tmpl w:val="607E5752"/>
+    <w:lvl w:ilvl="0">
+      <w:start w:val="1"/>
+      <w:numFmt w:val="bullet"/>
+      <w:lvlText w:val=""/>
+      <w:lvlJc w:val="left"/>
+      <w:pPr>
+        <w:tabs>
+          <w:tab w:val="num" w:pos="720"/>
+        </w:tabs>
+        <w:ind w:left="720" w:hanging="360"/>
+      </w:pPr>
+      <w:rPr>
+        <w:rFonts w:ascii="Symbol" w:hAnsi="Symbol" w:hint="default"/>
+        <w:sz w:val="20"/>
+      </w:rPr>
+    </w:lvl>
+    <w:lvl w:ilvl="1" w:tentative="1">
+      <w:start w:val="1"/>
+      <w:numFmt w:val="bullet"/>
+      <w:lvlText w:val="o"/>
+      <w:lvlJc w:val="left"/>
+      <w:pPr>
+        <w:tabs>
+          <w:tab w:val="num" w:pos="1440"/>
+        </w:tabs>
+        <w:ind w:left="1440" w:hanging="360"/>
+      </w:pPr>
+      <w:rPr>
+        <w:rFonts w:ascii="Courier New" w:hAnsi="Courier New" w:hint="default"/>
+        <w:sz w:val="20"/>
+      </w:rPr>
+    </w:lvl>
+    <w:lvl w:ilvl="2" w:tentative="1">
+      <w:start w:val="1"/>
+      <w:numFmt w:val="bullet"/>
+      <w:lvlText w:val=""/>
+      <w:lvlJc w:val="left"/>
+      <w:pPr>
+        <w:tabs>
+          <w:tab w:val="num" w:pos="2160"/>
+        </w:tabs>
+        <w:ind w:left="2160" w:hanging="360"/>
+      </w:pPr>
+      <w:rPr>
+        <w:rFonts w:ascii="Wingdings" w:hAnsi="Wingdings" w:hint="default"/>
+        <w:sz w:val="20"/>
+      </w:rPr>
+    </w:lvl>
+    <w:lvl w:ilvl="3" w:tentative="1">
+      <w:start w:val="1"/>
+      <w:numFmt w:val="bullet"/>
+      <w:lvlText w:val=""/>
+      <w:lvlJc w:val="left"/>
+      <w:pPr>
+        <w:tabs>
+          <w:tab w:val="num" w:pos="2880"/>
+        </w:tabs>
+        <w:ind w:left="2880" w:hanging="360"/>
+      </w:pPr>
+      <w:rPr>
+        <w:rFonts w:ascii="Wingdings" w:hAnsi="Wingdings" w:hint="default"/>
+        <w:sz w:val="20"/>
+      </w:rPr>
+    </w:lvl>
+    <w:lvl w:ilvl="4" w:tentative="1">
+      <w:start w:val="1"/>
+      <w:numFmt w:val="bullet"/>
+      <w:lvlText w:val=""/>
+      <w:lvlJc w:val="left"/>
+      <w:pPr>
+        <w:tabs>
+          <w:tab w:val="num" w:pos="3600"/>
+        </w:tabs>
+        <w:ind w:left="3600" w:hanging="360"/>
+      </w:pPr>
+      <w:rPr>
+        <w:rFonts w:ascii="Wingdings" w:hAnsi="Wingdings" w:hint="default"/>
+        <w:sz w:val="20"/>
+      </w:rPr>
+    </w:lvl>
+    <w:lvl w:ilvl="5" w:tentative="1">
+      <w:start w:val="1"/>
+      <w:numFmt w:val="bullet"/>
+      <w:lvlText w:val=""/>
+      <w:lvlJc w:val="left"/>
+      <w:pPr>
+        <w:tabs>
+          <w:tab w:val="num" w:pos="4320"/>
+        </w:tabs>
+        <w:ind w:left="4320" w:hanging="360"/>
+      </w:pPr>
+      <w:rPr>
+        <w:rFonts w:ascii="Wingdings" w:hAnsi="Wingdings" w:hint="default"/>
+        <w:sz w:val="20"/>
+      </w:rPr>
+    </w:lvl>
+    <w:lvl w:ilvl="6" w:tentative="1">
+      <w:start w:val="1"/>
+      <w:numFmt w:val="bullet"/>
+      <w:lvlText w:val=""/>
+      <w:lvlJc w:val="left"/>
+      <w:pPr>
+        <w:tabs>
+          <w:tab w:val="num" w:pos="5040"/>
+        </w:tabs>
+        <w:ind w:left="5040" w:hanging="360"/>
+      </w:pPr>
+      <w:rPr>
+        <w:rFonts w:ascii="Wingdings" w:hAnsi="Wingdings" w:hint="default"/>
+        <w:sz w:val="20"/>
+      </w:rPr>
+    </w:lvl>
+    <w:lvl w:ilvl="7" w:tentative="1">
+      <w:start w:val="1"/>
+      <w:numFmt w:val="bullet"/>
+      <w:lvlText w:val=""/>
+      <w:lvlJc w:val="left"/>
+      <w:pPr>
+        <w:tabs>
+          <w:tab w:val="num" w:pos="5760"/>
+        </w:tabs>
+        <w:ind w:left="5760" w:hanging="360"/>
+      </w:pPr>
+      <w:rPr>
+        <w:rFonts w:ascii="Wingdings" w:hAnsi="Wingdings" w:hint="default"/>
+        <w:sz w:val="20"/>
+      </w:rPr>
+    </w:lvl>
+    <w:lvl w:ilvl="8" w:tentative="1">
+      <w:start w:val="1"/>
+      <w:numFmt w:val="bullet"/>
+      <w:lvlText w:val=""/>
+      <w:lvlJc w:val="left"/>
+      <w:pPr>
+        <w:tabs>
+          <w:tab w:val="num" w:pos="6480"/>
+        </w:tabs>
+        <w:ind w:left="6480" w:hanging="360"/>
+      </w:pPr>
+      <w:rPr>
+        <w:rFonts w:ascii="Wingdings" w:hAnsi="Wingdings" w:hint="default"/>
+        <w:sz w:val="20"/>
+      </w:rPr>
+    </w:lvl>
+  </w:abstractNum>
+  <w:num w:numId="1" w16cid:durableId="890192231">
+    <w:abstractNumId w:val="0"/>
+  </w:num>
+  <w:num w:numId="2" w16cid:durableId="966087881">
+    <w:abstractNumId w:val="1"/>
+  </w:num>
+</w:numbering>
 </file>
 
 <file path=word/styles.xml><?xml version="1.0" encoding="utf-8"?>
@@ -413,6 +2166,7 @@
   <w:style w:type="paragraph" w:default="1" w:styleId="Norml">
     <w:name w:val="Normal"/>
     <w:qFormat/>
+    <w:rsid w:val="003E4E34"/>
   </w:style>
   <w:style w:type="paragraph" w:styleId="Cmsor1">
     <w:name w:val="heading 1"/>

</xml_diff>